<commit_message>
Memoria y archivo promedio jugadores ACTUALIZADO
</commit_message>
<xml_diff>
--- a/docs/PROYECTO TFG.docx
+++ b/docs/PROYECTO TFG.docx
@@ -5098,7 +5098,467 @@
           <w:sz w:val="28"/>
           <w:szCs w:val="28"/>
         </w:rPr>
-        <w:t>2. Importar Jugadores</w:t>
+        <w:t xml:space="preserve">2. Importar </w:t>
+      </w:r>
+      <w:r>
+        <w:rPr>
+          <w:rFonts w:ascii="Arial" w:hAnsi="Arial" w:cs="Arial"/>
+          <w:b/>
+          <w:bCs/>
+          <w:sz w:val="28"/>
+          <w:szCs w:val="28"/>
+        </w:rPr>
+        <w:t>Enfrentamientos</w:t>
+      </w:r>
+    </w:p>
+    <w:p>
+      <w:pPr>
+        <w:rPr>
+          <w:rFonts w:ascii="Arial" w:hAnsi="Arial" w:cs="Arial"/>
+        </w:rPr>
+      </w:pPr>
+      <w:r>
+        <w:rPr>
+          <w:rFonts w:ascii="Arial" w:hAnsi="Arial" w:cs="Arial"/>
+        </w:rPr>
+        <w:t>Game_Id</w:t>
+      </w:r>
+      <w:r>
+        <w:rPr>
+          <w:rFonts w:ascii="Arial" w:hAnsi="Arial" w:cs="Arial"/>
+        </w:rPr>
+        <w:tab/>
+      </w:r>
+      <w:r>
+        <w:rPr>
+          <w:rFonts w:ascii="Arial" w:hAnsi="Arial" w:cs="Arial"/>
+          <w:color w:val="196B24" w:themeColor="accent3"/>
+        </w:rPr>
+        <w:t>002</w:t>
+      </w:r>
+      <w:r>
+        <w:rPr>
+          <w:rFonts w:ascii="Arial" w:hAnsi="Arial" w:cs="Arial"/>
+        </w:rPr>
+        <w:tab/>
+      </w:r>
+      <w:r>
+        <w:rPr>
+          <w:rFonts w:ascii="Arial" w:hAnsi="Arial" w:cs="Arial"/>
+          <w:color w:val="A02B93" w:themeColor="accent5"/>
+        </w:rPr>
+        <w:t>24</w:t>
+      </w:r>
+      <w:r>
+        <w:rPr>
+          <w:rFonts w:ascii="Arial" w:hAnsi="Arial" w:cs="Arial"/>
+        </w:rPr>
+        <w:tab/>
+      </w:r>
+      <w:r>
+        <w:rPr>
+          <w:rFonts w:ascii="Arial" w:hAnsi="Arial" w:cs="Arial"/>
+        </w:rPr>
+        <w:t>0</w:t>
+      </w:r>
+      <w:r>
+        <w:rPr>
+          <w:rFonts w:ascii="Arial" w:hAnsi="Arial" w:cs="Arial"/>
+        </w:rPr>
+        <w:tab/>
+        <w:t>0061</w:t>
+      </w:r>
+      <w:r>
+        <w:rPr>
+          <w:rFonts w:ascii="Arial" w:hAnsi="Arial" w:cs="Arial"/>
+        </w:rPr>
+        <w:t>-1200</w:t>
+      </w:r>
+    </w:p>
+    <w:p>
+      <w:pPr>
+        <w:rPr>
+          <w:rFonts w:ascii="Arial" w:hAnsi="Arial" w:cs="Arial"/>
+          <w:sz w:val="22"/>
+          <w:szCs w:val="22"/>
+        </w:rPr>
+      </w:pPr>
+      <w:r>
+        <w:rPr>
+          <w:rFonts w:ascii="Arial" w:hAnsi="Arial" w:cs="Arial"/>
+          <w:color w:val="196B24" w:themeColor="accent3"/>
+          <w:sz w:val="22"/>
+          <w:szCs w:val="22"/>
+        </w:rPr>
+        <w:t>Temporada regular</w:t>
+      </w:r>
+      <w:r>
+        <w:rPr>
+          <w:rFonts w:ascii="Arial" w:hAnsi="Arial" w:cs="Arial"/>
+          <w:color w:val="196B24" w:themeColor="accent3"/>
+          <w:sz w:val="22"/>
+          <w:szCs w:val="22"/>
+        </w:rPr>
+        <w:t xml:space="preserve"> </w:t>
+      </w:r>
+      <w:r>
+        <w:rPr>
+          <w:rFonts w:ascii="Arial" w:hAnsi="Arial" w:cs="Arial"/>
+          <w:sz w:val="22"/>
+          <w:szCs w:val="22"/>
+        </w:rPr>
+        <w:t xml:space="preserve">- </w:t>
+      </w:r>
+      <w:r>
+        <w:rPr>
+          <w:rFonts w:ascii="Arial" w:hAnsi="Arial" w:cs="Arial"/>
+          <w:color w:val="501549" w:themeColor="accent5" w:themeShade="80"/>
+          <w:sz w:val="22"/>
+          <w:szCs w:val="22"/>
+        </w:rPr>
+        <w:t>año temporada</w:t>
+      </w:r>
+      <w:r>
+        <w:rPr>
+          <w:rFonts w:ascii="Arial" w:hAnsi="Arial" w:cs="Arial"/>
+          <w:color w:val="501549" w:themeColor="accent5" w:themeShade="80"/>
+          <w:sz w:val="22"/>
+          <w:szCs w:val="22"/>
+        </w:rPr>
+        <w:t xml:space="preserve"> </w:t>
+      </w:r>
+      <w:r>
+        <w:rPr>
+          <w:rFonts w:ascii="Arial" w:hAnsi="Arial" w:cs="Arial"/>
+          <w:sz w:val="22"/>
+          <w:szCs w:val="22"/>
+        </w:rPr>
+        <w:t xml:space="preserve">– prefijo - </w:t>
+      </w:r>
+      <w:r>
+        <w:rPr>
+          <w:rFonts w:ascii="Arial" w:hAnsi="Arial" w:cs="Arial"/>
+          <w:sz w:val="22"/>
+          <w:szCs w:val="22"/>
+        </w:rPr>
+        <w:t xml:space="preserve">nº </w:t>
+      </w:r>
+      <w:r>
+        <w:rPr>
+          <w:rFonts w:ascii="Arial" w:hAnsi="Arial" w:cs="Arial"/>
+          <w:sz w:val="22"/>
+          <w:szCs w:val="22"/>
+        </w:rPr>
+        <w:t>partido</w:t>
+      </w:r>
+      <w:r>
+        <w:rPr>
+          <w:rFonts w:ascii="Arial" w:hAnsi="Arial" w:cs="Arial"/>
+          <w:sz w:val="22"/>
+          <w:szCs w:val="22"/>
+        </w:rPr>
+        <w:t xml:space="preserve"> (empieza siempre por el 61</w:t>
+      </w:r>
+      <w:r>
+        <w:rPr>
+          <w:rFonts w:ascii="Arial" w:hAnsi="Arial" w:cs="Arial"/>
+          <w:sz w:val="22"/>
+          <w:szCs w:val="22"/>
+        </w:rPr>
+        <w:t>)</w:t>
+      </w:r>
+    </w:p>
+    <w:p>
+      <w:pPr>
+        <w:rPr>
+          <w:rFonts w:ascii="Arial" w:hAnsi="Arial" w:cs="Arial"/>
+          <w:sz w:val="22"/>
+          <w:szCs w:val="22"/>
+        </w:rPr>
+      </w:pPr>
+      <w:r>
+        <w:rPr>
+          <w:rFonts w:ascii="Arial" w:hAnsi="Arial" w:cs="Arial"/>
+          <w:sz w:val="22"/>
+          <w:szCs w:val="22"/>
+        </w:rPr>
+        <w:t>Lo normal es que los partidos vayan del 0001 al 1230 (82 partidos cada equipo)</w:t>
+      </w:r>
+      <w:r>
+        <w:rPr>
+          <w:rFonts w:ascii="Arial" w:hAnsi="Arial" w:cs="Arial"/>
+          <w:sz w:val="22"/>
+          <w:szCs w:val="22"/>
+        </w:rPr>
+        <w:t>.</w:t>
+      </w:r>
+    </w:p>
+    <w:p>
+      <w:pPr>
+        <w:rPr>
+          <w:rFonts w:ascii="Arial" w:hAnsi="Arial" w:cs="Arial"/>
+          <w:sz w:val="22"/>
+          <w:szCs w:val="22"/>
+        </w:rPr>
+      </w:pPr>
+      <w:r>
+        <w:rPr>
+          <w:rFonts w:ascii="Arial" w:hAnsi="Arial" w:cs="Arial"/>
+          <w:sz w:val="22"/>
+          <w:szCs w:val="22"/>
+        </w:rPr>
+        <w:t>Pero desde que añadieron la competición de la NBA Cup, que se juega entre medias de la temporada regular, han cambiado los id y orden de los partidos.</w:t>
+      </w:r>
+    </w:p>
+    <w:p>
+      <w:pPr>
+        <w:rPr>
+          <w:rFonts w:ascii="Arial" w:hAnsi="Arial" w:cs="Arial"/>
+          <w:sz w:val="22"/>
+          <w:szCs w:val="22"/>
+        </w:rPr>
+      </w:pPr>
+      <w:r>
+        <w:rPr>
+          <w:rFonts w:ascii="Arial" w:hAnsi="Arial" w:cs="Arial"/>
+          <w:sz w:val="22"/>
+          <w:szCs w:val="22"/>
+        </w:rPr>
+        <w:t>En la temporada 23/24 a partir del id 1231 eran partidos de la NBA Cup.</w:t>
+      </w:r>
+    </w:p>
+    <w:p>
+      <w:pPr>
+        <w:rPr>
+          <w:rFonts w:ascii="Arial" w:hAnsi="Arial" w:cs="Arial"/>
+          <w:sz w:val="22"/>
+          <w:szCs w:val="22"/>
+        </w:rPr>
+      </w:pPr>
+      <w:r>
+        <w:rPr>
+          <w:rFonts w:ascii="Arial" w:hAnsi="Arial" w:cs="Arial"/>
+          <w:sz w:val="22"/>
+          <w:szCs w:val="22"/>
+        </w:rPr>
+        <w:t xml:space="preserve">Esta temporada 24/25 </w:t>
+      </w:r>
+      <w:r>
+        <w:rPr>
+          <w:rFonts w:ascii="Arial" w:hAnsi="Arial" w:cs="Arial"/>
+          <w:sz w:val="22"/>
+          <w:szCs w:val="22"/>
+        </w:rPr>
+        <w:t>los partidos de la NBA Cup van del 0001 al 0060, por tanto los de la temporada regular van</w:t>
+      </w:r>
+      <w:r>
+        <w:rPr>
+          <w:rFonts w:ascii="Arial" w:hAnsi="Arial" w:cs="Arial"/>
+          <w:sz w:val="22"/>
+          <w:szCs w:val="22"/>
+        </w:rPr>
+        <w:t xml:space="preserve"> del 0061 al 1290</w:t>
+      </w:r>
+      <w:r>
+        <w:rPr>
+          <w:rFonts w:ascii="Arial" w:hAnsi="Arial" w:cs="Arial"/>
+          <w:sz w:val="22"/>
+          <w:szCs w:val="22"/>
+        </w:rPr>
+        <w:t>.</w:t>
+      </w:r>
+    </w:p>
+    <w:p>
+      <w:pPr>
+        <w:rPr>
+          <w:rFonts w:ascii="Arial" w:hAnsi="Arial" w:cs="Arial"/>
+          <w:sz w:val="22"/>
+          <w:szCs w:val="22"/>
+        </w:rPr>
+      </w:pPr>
+      <w:r>
+        <w:rPr>
+          <w:rFonts w:ascii="Arial" w:hAnsi="Arial" w:cs="Arial"/>
+          <w:sz w:val="22"/>
+          <w:szCs w:val="22"/>
+        </w:rPr>
+        <w:t>Esperemos que en las próximas temporadas se mantenga así</w:t>
+      </w:r>
+      <w:r>
+        <w:rPr>
+          <w:rFonts w:ascii="Arial" w:hAnsi="Arial" w:cs="Arial"/>
+          <w:sz w:val="22"/>
+          <w:szCs w:val="22"/>
+        </w:rPr>
+        <w:t>.</w:t>
+      </w:r>
+    </w:p>
+    <w:p>
+      <w:pPr>
+        <w:rPr>
+          <w:rFonts w:ascii="Arial" w:hAnsi="Arial" w:cs="Arial"/>
+          <w:sz w:val="22"/>
+          <w:szCs w:val="22"/>
+        </w:rPr>
+      </w:pPr>
+    </w:p>
+    <w:p>
+      <w:pPr>
+        <w:rPr>
+          <w:rFonts w:ascii="Arial" w:hAnsi="Arial" w:cs="Arial"/>
+          <w:sz w:val="22"/>
+          <w:szCs w:val="22"/>
+        </w:rPr>
+      </w:pPr>
+      <w:r>
+        <w:rPr>
+          <w:rFonts w:ascii="Arial" w:hAnsi="Arial" w:cs="Arial"/>
+          <w:sz w:val="22"/>
+          <w:szCs w:val="22"/>
+        </w:rPr>
+        <w:t>Una vez explicado esto ya podemos ver cómo he conseguido importar los datos:</w:t>
+      </w:r>
+    </w:p>
+    <w:p>
+      <w:pPr>
+        <w:rPr>
+          <w:rFonts w:ascii="Arial" w:hAnsi="Arial" w:cs="Arial"/>
+          <w:sz w:val="22"/>
+          <w:szCs w:val="22"/>
+        </w:rPr>
+      </w:pPr>
+    </w:p>
+    <w:p>
+      <w:pPr>
+        <w:rPr>
+          <w:rFonts w:ascii="Arial" w:hAnsi="Arial" w:cs="Arial"/>
+          <w:sz w:val="22"/>
+          <w:szCs w:val="22"/>
+        </w:rPr>
+      </w:pPr>
+      <w:r>
+        <w:rPr>
+          <w:rFonts w:ascii="Arial" w:hAnsi="Arial" w:cs="Arial"/>
+          <w:sz w:val="22"/>
+          <w:szCs w:val="22"/>
+        </w:rPr>
+        <w:lastRenderedPageBreak/>
+        <w:t xml:space="preserve">Utilizando el endpoint </w:t>
+      </w:r>
+      <w:r>
+        <w:rPr>
+          <w:rFonts w:ascii="Arial" w:hAnsi="Arial" w:cs="Arial"/>
+          <w:i/>
+          <w:iCs/>
+          <w:sz w:val="22"/>
+          <w:szCs w:val="22"/>
+        </w:rPr>
+        <w:t>boxscoresummaryv2</w:t>
+      </w:r>
+      <w:r>
+        <w:rPr>
+          <w:rFonts w:ascii="Arial" w:hAnsi="Arial" w:cs="Arial"/>
+          <w:sz w:val="22"/>
+          <w:szCs w:val="22"/>
+        </w:rPr>
+        <w:t xml:space="preserve"> podemos recorrer todos los enfrentamientos (desde el id 0061 hasta el 1290). Estos parámetros, y los de temporada se podrían cambiar pues el game_id viene dado por el archivo properties</w:t>
+      </w:r>
+      <w:r>
+        <w:rPr>
+          <w:rFonts w:ascii="Arial" w:hAnsi="Arial" w:cs="Arial"/>
+          <w:sz w:val="22"/>
+          <w:szCs w:val="22"/>
+        </w:rPr>
+        <w:t xml:space="preserve"> para que esto sea automatizado y dinámico.</w:t>
+      </w:r>
+    </w:p>
+    <w:p>
+      <w:pPr>
+        <w:rPr>
+          <w:rFonts w:ascii="Arial" w:hAnsi="Arial" w:cs="Arial"/>
+          <w:sz w:val="22"/>
+          <w:szCs w:val="22"/>
+        </w:rPr>
+      </w:pPr>
+      <w:r>
+        <w:rPr>
+          <w:rFonts w:ascii="Arial" w:hAnsi="Arial" w:cs="Arial"/>
+          <w:sz w:val="22"/>
+          <w:szCs w:val="22"/>
+        </w:rPr>
+        <w:t>Uso este endpoint pues proporciona los ids y nombres de los equipos, así como sus puntos finales y la fecha. Es decir, todos los datos necesarios para mi tabla Enfrentamientos.</w:t>
+      </w:r>
+    </w:p>
+    <w:p>
+      <w:pPr>
+        <w:rPr>
+          <w:rFonts w:ascii="Arial" w:hAnsi="Arial" w:cs="Arial"/>
+          <w:sz w:val="22"/>
+          <w:szCs w:val="22"/>
+        </w:rPr>
+      </w:pPr>
+      <w:r>
+        <w:rPr>
+          <w:rFonts w:ascii="Arial" w:hAnsi="Arial" w:cs="Arial"/>
+          <w:sz w:val="22"/>
+          <w:szCs w:val="22"/>
+        </w:rPr>
+        <w:t>En mi caso genero un archivo .sql con una consulta INSER</w:t>
+      </w:r>
+      <w:r>
+        <w:rPr>
+          <w:rFonts w:ascii="Arial" w:hAnsi="Arial" w:cs="Arial"/>
+          <w:sz w:val="22"/>
+          <w:szCs w:val="22"/>
+        </w:rPr>
+        <w:t>T</w:t>
+      </w:r>
+      <w:r>
+        <w:rPr>
+          <w:rFonts w:ascii="Arial" w:hAnsi="Arial" w:cs="Arial"/>
+          <w:sz w:val="22"/>
+          <w:szCs w:val="22"/>
+        </w:rPr>
+        <w:t xml:space="preserve">. Esto se podría insertar directamente en la Base de Datos, pero prefiero </w:t>
+      </w:r>
+      <w:r>
+        <w:rPr>
+          <w:rFonts w:ascii="Arial" w:hAnsi="Arial" w:cs="Arial"/>
+          <w:sz w:val="22"/>
+          <w:szCs w:val="22"/>
+        </w:rPr>
+        <w:t>generar un archivo .sql para revisar y tratar mejor los datos.</w:t>
+      </w:r>
+    </w:p>
+    <w:p>
+      <w:pPr>
+        <w:rPr>
+          <w:rFonts w:ascii="Arial" w:hAnsi="Arial" w:cs="Arial"/>
+          <w:b/>
+          <w:bCs/>
+          <w:sz w:val="28"/>
+          <w:szCs w:val="28"/>
+        </w:rPr>
+      </w:pPr>
+      <w:r>
+        <w:rPr>
+          <w:rFonts w:ascii="Arial" w:hAnsi="Arial" w:cs="Arial"/>
+          <w:b/>
+          <w:bCs/>
+          <w:sz w:val="28"/>
+          <w:szCs w:val="28"/>
+        </w:rPr>
+        <w:t>3</w:t>
+      </w:r>
+      <w:r>
+        <w:rPr>
+          <w:rFonts w:ascii="Arial" w:hAnsi="Arial" w:cs="Arial"/>
+          <w:b/>
+          <w:bCs/>
+          <w:sz w:val="28"/>
+          <w:szCs w:val="28"/>
+        </w:rPr>
+        <w:t>. Importar Jugadores</w:t>
       </w:r>
     </w:p>
     <w:p>
@@ -5285,6 +5745,246 @@
           <w:sz w:val="20"/>
           <w:szCs w:val="20"/>
         </w:rPr>
+        <w:t>Así que vamos a hacer algo parecido como con los enfrentamientos.</w:t>
+      </w:r>
+    </w:p>
+    <w:p>
+      <w:pPr>
+        <w:rPr>
+          <w:rFonts w:ascii="Arial" w:hAnsi="Arial" w:cs="Arial"/>
+          <w:sz w:val="20"/>
+          <w:szCs w:val="20"/>
+        </w:rPr>
+      </w:pPr>
+      <w:r>
+        <w:rPr>
+          <w:rFonts w:ascii="Arial" w:hAnsi="Arial" w:cs="Arial"/>
+          <w:sz w:val="20"/>
+          <w:szCs w:val="20"/>
+        </w:rPr>
+        <w:t>Debido a que hay un mercado de fichajes de invierno, si quiero obtener el equipo más actual del jugador recorreré los enfrentamientos de final a principio, obviando aquellos jugadores que ya hayan sido insertados.</w:t>
+      </w:r>
+    </w:p>
+    <w:p>
+      <w:pPr>
+        <w:rPr>
+          <w:rFonts w:ascii="Arial" w:hAnsi="Arial" w:cs="Arial"/>
+          <w:sz w:val="20"/>
+          <w:szCs w:val="20"/>
+        </w:rPr>
+      </w:pPr>
+      <w:r>
+        <w:rPr>
+          <w:rFonts w:ascii="Arial" w:hAnsi="Arial" w:cs="Arial"/>
+          <w:sz w:val="20"/>
+          <w:szCs w:val="20"/>
+        </w:rPr>
+        <w:t xml:space="preserve">Por </w:t>
+      </w:r>
+      <w:r>
+        <w:rPr>
+          <w:rFonts w:ascii="Arial" w:hAnsi="Arial" w:cs="Arial"/>
+          <w:sz w:val="20"/>
+          <w:szCs w:val="20"/>
+        </w:rPr>
+        <w:t>ejemplo,</w:t>
+      </w:r>
+      <w:r>
+        <w:rPr>
+          <w:rFonts w:ascii="Arial" w:hAnsi="Arial" w:cs="Arial"/>
+          <w:sz w:val="20"/>
+          <w:szCs w:val="20"/>
+        </w:rPr>
+        <w:t xml:space="preserve"> Luka Doncic jugaba para los Dallas Mavericks pero a mitad de temporada lo traspasaron a Los Angeles Lakers. Si empiezo a rastrear los partidos desde el final, con el endpoint </w:t>
+      </w:r>
+      <w:r>
+        <w:rPr>
+          <w:rFonts w:ascii="Arial" w:hAnsi="Arial" w:cs="Arial"/>
+          <w:i/>
+          <w:iCs/>
+          <w:sz w:val="20"/>
+          <w:szCs w:val="20"/>
+        </w:rPr>
+        <w:t>boxscoretraditionalv2</w:t>
+      </w:r>
+      <w:r>
+        <w:rPr>
+          <w:rFonts w:ascii="Arial" w:hAnsi="Arial" w:cs="Arial"/>
+          <w:i/>
+          <w:iCs/>
+          <w:sz w:val="20"/>
+          <w:szCs w:val="20"/>
+        </w:rPr>
+        <w:t xml:space="preserve"> </w:t>
+      </w:r>
+      <w:r>
+        <w:rPr>
+          <w:rFonts w:ascii="Arial" w:hAnsi="Arial" w:cs="Arial"/>
+          <w:sz w:val="20"/>
+          <w:szCs w:val="20"/>
+        </w:rPr>
+        <w:t>puedo</w:t>
+      </w:r>
+      <w:r>
+        <w:rPr>
+          <w:rFonts w:ascii="Arial" w:hAnsi="Arial" w:cs="Arial"/>
+          <w:sz w:val="20"/>
+          <w:szCs w:val="20"/>
+        </w:rPr>
+        <w:t xml:space="preserve"> obtener los nombres, id, equipo y posición de los jugadores de ese partido y obtendré los valores más recientes, es decir, el equipo actual.</w:t>
+      </w:r>
+    </w:p>
+    <w:p>
+      <w:pPr>
+        <w:rPr>
+          <w:rFonts w:ascii="Arial" w:hAnsi="Arial" w:cs="Arial"/>
+          <w:sz w:val="20"/>
+          <w:szCs w:val="20"/>
+        </w:rPr>
+      </w:pPr>
+      <w:r>
+        <w:rPr>
+          <w:rFonts w:ascii="Arial" w:hAnsi="Arial" w:cs="Arial"/>
+          <w:sz w:val="20"/>
+          <w:szCs w:val="20"/>
+        </w:rPr>
+        <w:t>Aquí una vez termine la temporada he de poner el start_id (1290) y end_id (0061) para ir de final a principio.</w:t>
+      </w:r>
+    </w:p>
+    <w:p>
+      <w:pPr>
+        <w:rPr>
+          <w:rFonts w:ascii="Arial" w:hAnsi="Arial" w:cs="Arial"/>
+          <w:sz w:val="20"/>
+          <w:szCs w:val="20"/>
+        </w:rPr>
+      </w:pPr>
+      <w:r>
+        <w:rPr>
+          <w:rFonts w:ascii="Arial" w:hAnsi="Arial" w:cs="Arial"/>
+          <w:sz w:val="20"/>
+          <w:szCs w:val="20"/>
+        </w:rPr>
+        <w:br w:type="page"/>
+      </w:r>
+    </w:p>
+    <w:p>
+      <w:pPr>
+        <w:rPr>
+          <w:rFonts w:ascii="Arial" w:hAnsi="Arial" w:cs="Arial"/>
+          <w:b/>
+          <w:bCs/>
+          <w:sz w:val="40"/>
+          <w:szCs w:val="40"/>
+        </w:rPr>
+      </w:pPr>
+      <w:r>
+        <w:rPr>
+          <w:rFonts w:ascii="Arial" w:hAnsi="Arial" w:cs="Arial"/>
+          <w:b/>
+          <w:bCs/>
+          <w:sz w:val="40"/>
+          <w:szCs w:val="40"/>
+        </w:rPr>
+        <w:lastRenderedPageBreak/>
+        <w:t>CAMBIOS BASE DE DATOS</w:t>
+      </w:r>
+    </w:p>
+    <w:p>
+      <w:pPr>
+        <w:pStyle w:val="Prrafodelista"/>
+        <w:numPr>
+          <w:ilvl w:val="1"/>
+          <w:numId w:val="32"/>
+        </w:numPr>
+        <w:rPr>
+          <w:rFonts w:ascii="Arial" w:hAnsi="Arial" w:cs="Arial"/>
+        </w:rPr>
+      </w:pPr>
+      <w:r>
+        <w:rPr>
+          <w:rFonts w:ascii="Arial" w:hAnsi="Arial" w:cs="Arial"/>
+        </w:rPr>
+        <w:t>En un principio las estadísticas promedio de cada jugador</w:t>
+      </w:r>
+      <w:r>
+        <w:rPr>
+          <w:rFonts w:ascii="Arial" w:hAnsi="Arial" w:cs="Arial"/>
+        </w:rPr>
+        <w:t xml:space="preserve"> y equipo</w:t>
+      </w:r>
+      <w:r>
+        <w:rPr>
+          <w:rFonts w:ascii="Arial" w:hAnsi="Arial" w:cs="Arial"/>
+        </w:rPr>
+        <w:t xml:space="preserve"> se iban a realizar con vistas, pero debido a complicaciones para obtener algunas de ellas, como los win shares, mediante endpoints</w:t>
+      </w:r>
+      <w:r>
+        <w:rPr>
+          <w:rFonts w:ascii="Arial" w:hAnsi="Arial" w:cs="Arial"/>
+        </w:rPr>
+        <w:t>,</w:t>
+      </w:r>
+      <w:r>
+        <w:rPr>
+          <w:rFonts w:ascii="Arial" w:hAnsi="Arial" w:cs="Arial"/>
+        </w:rPr>
+        <w:t xml:space="preserve"> se ha decidido cambiar a una tabla normal. Pues gracias a </w:t>
+      </w:r>
+      <w:r>
+        <w:rPr>
+          <w:rFonts w:ascii="Arial" w:hAnsi="Arial" w:cs="Arial"/>
+        </w:rPr>
+        <w:t xml:space="preserve">Basketball Reference </w:t>
+      </w:r>
+      <w:hyperlink r:id="rId21" w:history="1">
+        <w:r>
+          <w:rPr>
+            <w:rStyle w:val="Hipervnculo"/>
+            <w:rFonts w:ascii="Arial" w:hAnsi="Arial" w:cs="Arial"/>
+          </w:rPr>
+          <w:t>https://www.basketball-reference.com/leagues/NBA_2025_per_game.html</w:t>
+        </w:r>
+      </w:hyperlink>
+      <w:r>
+        <w:rPr>
+          <w:rFonts w:ascii="Arial" w:hAnsi="Arial" w:cs="Arial"/>
+        </w:rPr>
+        <w:t xml:space="preserve"> puedo obtener dichas tablas por lo que simplemente tendré que añadir la consulta insert para tener los datos en mi base de datos.</w:t>
+      </w:r>
+    </w:p>
+    <w:p>
+      <w:pPr>
+        <w:pStyle w:val="Prrafodelista"/>
+        <w:numPr>
+          <w:ilvl w:val="1"/>
+          <w:numId w:val="32"/>
+        </w:numPr>
+        <w:rPr>
+          <w:rFonts w:ascii="Arial" w:hAnsi="Arial" w:cs="Arial"/>
+        </w:rPr>
+      </w:pPr>
+      <w:r>
+        <w:rPr>
+          <w:rFonts w:ascii="Arial" w:hAnsi="Arial" w:cs="Arial"/>
+        </w:rPr>
+        <w:t>Se ha añadido también la tabla Temporada tipo enumerado, que conecta a las tablas de promedio jugador y promedio equipo</w:t>
+      </w:r>
+    </w:p>
+    <w:p>
+      <w:pPr>
+        <w:rPr>
+          <w:rFonts w:ascii="Arial" w:hAnsi="Arial" w:cs="Arial"/>
+          <w:sz w:val="20"/>
+          <w:szCs w:val="20"/>
+        </w:rPr>
+      </w:pPr>
+      <w:r>
+        <w:rPr>
+          <w:rFonts w:ascii="Arial" w:hAnsi="Arial" w:cs="Arial"/>
+          <w:sz w:val="20"/>
+          <w:szCs w:val="20"/>
+        </w:rPr>
         <w:tab/>
       </w:r>
       <w:r>
@@ -5720,6 +6420,119 @@
     </w:lvl>
   </w:abstractNum>
   <w:abstractNum w:abstractNumId="3" w15:restartNumberingAfterBreak="0">
+    <w:nsid w:val="1127401B"/>
+    <w:multiLevelType w:val="multilevel"/>
+    <w:tmpl w:val="3F644F6C"/>
+    <w:lvl w:ilvl="0">
+      <w:start w:val="1"/>
+      <w:numFmt w:val="decimal"/>
+      <w:lvlText w:val="%1."/>
+      <w:lvlJc w:val="left"/>
+      <w:pPr>
+        <w:ind w:left="465" w:hanging="465"/>
+      </w:pPr>
+      <w:rPr>
+        <w:rFonts w:hint="default"/>
+      </w:rPr>
+    </w:lvl>
+    <w:lvl w:ilvl="1">
+      <w:start w:val="1"/>
+      <w:numFmt w:val="decimal"/>
+      <w:lvlText w:val="%1.%2."/>
+      <w:lvlJc w:val="left"/>
+      <w:pPr>
+        <w:ind w:left="720" w:hanging="720"/>
+      </w:pPr>
+      <w:rPr>
+        <w:rFonts w:hint="default"/>
+      </w:rPr>
+    </w:lvl>
+    <w:lvl w:ilvl="2">
+      <w:start w:val="1"/>
+      <w:numFmt w:val="decimal"/>
+      <w:lvlText w:val="%1.%2.%3."/>
+      <w:lvlJc w:val="left"/>
+      <w:pPr>
+        <w:ind w:left="720" w:hanging="720"/>
+      </w:pPr>
+      <w:rPr>
+        <w:rFonts w:hint="default"/>
+      </w:rPr>
+    </w:lvl>
+    <w:lvl w:ilvl="3">
+      <w:start w:val="1"/>
+      <w:numFmt w:val="decimal"/>
+      <w:lvlText w:val="%1.%2.%3.%4."/>
+      <w:lvlJc w:val="left"/>
+      <w:pPr>
+        <w:ind w:left="1080" w:hanging="1080"/>
+      </w:pPr>
+      <w:rPr>
+        <w:rFonts w:hint="default"/>
+      </w:rPr>
+    </w:lvl>
+    <w:lvl w:ilvl="4">
+      <w:start w:val="1"/>
+      <w:numFmt w:val="decimal"/>
+      <w:lvlText w:val="%1.%2.%3.%4.%5."/>
+      <w:lvlJc w:val="left"/>
+      <w:pPr>
+        <w:ind w:left="1080" w:hanging="1080"/>
+      </w:pPr>
+      <w:rPr>
+        <w:rFonts w:hint="default"/>
+      </w:rPr>
+    </w:lvl>
+    <w:lvl w:ilvl="5">
+      <w:start w:val="1"/>
+      <w:numFmt w:val="decimal"/>
+      <w:lvlText w:val="%1.%2.%3.%4.%5.%6."/>
+      <w:lvlJc w:val="left"/>
+      <w:pPr>
+        <w:ind w:left="1440" w:hanging="1440"/>
+      </w:pPr>
+      <w:rPr>
+        <w:rFonts w:hint="default"/>
+      </w:rPr>
+    </w:lvl>
+    <w:lvl w:ilvl="6">
+      <w:start w:val="1"/>
+      <w:numFmt w:val="decimal"/>
+      <w:lvlText w:val="%1.%2.%3.%4.%5.%6.%7."/>
+      <w:lvlJc w:val="left"/>
+      <w:pPr>
+        <w:ind w:left="1440" w:hanging="1440"/>
+      </w:pPr>
+      <w:rPr>
+        <w:rFonts w:hint="default"/>
+      </w:rPr>
+    </w:lvl>
+    <w:lvl w:ilvl="7">
+      <w:start w:val="1"/>
+      <w:numFmt w:val="decimal"/>
+      <w:lvlText w:val="%1.%2.%3.%4.%5.%6.%7.%8."/>
+      <w:lvlJc w:val="left"/>
+      <w:pPr>
+        <w:ind w:left="1800" w:hanging="1800"/>
+      </w:pPr>
+      <w:rPr>
+        <w:rFonts w:hint="default"/>
+      </w:rPr>
+    </w:lvl>
+    <w:lvl w:ilvl="8">
+      <w:start w:val="1"/>
+      <w:numFmt w:val="decimal"/>
+      <w:lvlText w:val="%1.%2.%3.%4.%5.%6.%7.%8.%9."/>
+      <w:lvlJc w:val="left"/>
+      <w:pPr>
+        <w:ind w:left="2160" w:hanging="2160"/>
+      </w:pPr>
+      <w:rPr>
+        <w:rFonts w:hint="default"/>
+      </w:rPr>
+    </w:lvl>
+  </w:abstractNum>
+  <w:abstractNum w:abstractNumId="4" w15:restartNumberingAfterBreak="0">
     <w:nsid w:val="12E6469C"/>
     <w:multiLevelType w:val="multilevel"/>
     <w:tmpl w:val="3AB4578A"/>
@@ -5868,7 +6681,7 @@
       </w:rPr>
     </w:lvl>
   </w:abstractNum>
-  <w:abstractNum w:abstractNumId="4" w15:restartNumberingAfterBreak="0">
+  <w:abstractNum w:abstractNumId="5" w15:restartNumberingAfterBreak="0">
     <w:nsid w:val="13AEFADF"/>
     <w:multiLevelType w:val="hybridMultilevel"/>
     <w:tmpl w:val="2F4C00AE"/>
@@ -5954,7 +6767,7 @@
       </w:pPr>
     </w:lvl>
   </w:abstractNum>
-  <w:abstractNum w:abstractNumId="5" w15:restartNumberingAfterBreak="0">
+  <w:abstractNum w:abstractNumId="6" w15:restartNumberingAfterBreak="0">
     <w:nsid w:val="17FA0E7C"/>
     <w:multiLevelType w:val="multilevel"/>
     <w:tmpl w:val="AAF86D70"/>
@@ -6067,7 +6880,7 @@
       </w:pPr>
     </w:lvl>
   </w:abstractNum>
-  <w:abstractNum w:abstractNumId="6" w15:restartNumberingAfterBreak="0">
+  <w:abstractNum w:abstractNumId="7" w15:restartNumberingAfterBreak="0">
     <w:nsid w:val="205B0A12"/>
     <w:multiLevelType w:val="multilevel"/>
     <w:tmpl w:val="2C182386"/>
@@ -6216,7 +7029,7 @@
       </w:rPr>
     </w:lvl>
   </w:abstractNum>
-  <w:abstractNum w:abstractNumId="7" w15:restartNumberingAfterBreak="0">
+  <w:abstractNum w:abstractNumId="8" w15:restartNumberingAfterBreak="0">
     <w:nsid w:val="2F5F1EE3"/>
     <w:multiLevelType w:val="multilevel"/>
     <w:tmpl w:val="2A1CC3B2"/>
@@ -6333,7 +7146,7 @@
       </w:pPr>
     </w:lvl>
   </w:abstractNum>
-  <w:abstractNum w:abstractNumId="8" w15:restartNumberingAfterBreak="0">
+  <w:abstractNum w:abstractNumId="9" w15:restartNumberingAfterBreak="0">
     <w:nsid w:val="453955E1"/>
     <w:multiLevelType w:val="hybridMultilevel"/>
     <w:tmpl w:val="2D98789A"/>
@@ -6446,7 +7259,7 @@
       </w:rPr>
     </w:lvl>
   </w:abstractNum>
-  <w:abstractNum w:abstractNumId="9" w15:restartNumberingAfterBreak="0">
+  <w:abstractNum w:abstractNumId="10" w15:restartNumberingAfterBreak="0">
     <w:nsid w:val="4A9C00FB"/>
     <w:multiLevelType w:val="multilevel"/>
     <w:tmpl w:val="AFD02C9A"/>
@@ -6559,7 +7372,7 @@
       </w:pPr>
     </w:lvl>
   </w:abstractNum>
-  <w:abstractNum w:abstractNumId="10" w15:restartNumberingAfterBreak="0">
+  <w:abstractNum w:abstractNumId="11" w15:restartNumberingAfterBreak="0">
     <w:nsid w:val="4B3C0247"/>
     <w:multiLevelType w:val="multilevel"/>
     <w:tmpl w:val="34BC60BE"/>
@@ -6672,7 +7485,7 @@
       </w:pPr>
     </w:lvl>
   </w:abstractNum>
-  <w:abstractNum w:abstractNumId="11" w15:restartNumberingAfterBreak="0">
+  <w:abstractNum w:abstractNumId="12" w15:restartNumberingAfterBreak="0">
     <w:nsid w:val="4DE17CEE"/>
     <w:multiLevelType w:val="multilevel"/>
     <w:tmpl w:val="0A1AF8D6"/>
@@ -6821,7 +7634,7 @@
       </w:rPr>
     </w:lvl>
   </w:abstractNum>
-  <w:abstractNum w:abstractNumId="12" w15:restartNumberingAfterBreak="0">
+  <w:abstractNum w:abstractNumId="13" w15:restartNumberingAfterBreak="0">
     <w:nsid w:val="4DE751ED"/>
     <w:multiLevelType w:val="multilevel"/>
     <w:tmpl w:val="53A0A6AA"/>
@@ -6970,7 +7783,7 @@
       </w:rPr>
     </w:lvl>
   </w:abstractNum>
-  <w:abstractNum w:abstractNumId="13" w15:restartNumberingAfterBreak="0">
+  <w:abstractNum w:abstractNumId="14" w15:restartNumberingAfterBreak="0">
     <w:nsid w:val="4EC10570"/>
     <w:multiLevelType w:val="multilevel"/>
     <w:tmpl w:val="8C02BAD4"/>
@@ -7119,7 +7932,7 @@
       </w:rPr>
     </w:lvl>
   </w:abstractNum>
-  <w:abstractNum w:abstractNumId="14" w15:restartNumberingAfterBreak="0">
+  <w:abstractNum w:abstractNumId="15" w15:restartNumberingAfterBreak="0">
     <w:nsid w:val="505B7E0C"/>
     <w:multiLevelType w:val="multilevel"/>
     <w:tmpl w:val="B8AADB42"/>
@@ -7232,7 +8045,7 @@
       </w:pPr>
     </w:lvl>
   </w:abstractNum>
-  <w:abstractNum w:abstractNumId="15" w15:restartNumberingAfterBreak="0">
+  <w:abstractNum w:abstractNumId="16" w15:restartNumberingAfterBreak="0">
     <w:nsid w:val="507C5DF2"/>
     <w:multiLevelType w:val="multilevel"/>
     <w:tmpl w:val="A6FA3404"/>
@@ -7345,7 +8158,7 @@
       </w:pPr>
     </w:lvl>
   </w:abstractNum>
-  <w:abstractNum w:abstractNumId="16" w15:restartNumberingAfterBreak="0">
+  <w:abstractNum w:abstractNumId="17" w15:restartNumberingAfterBreak="0">
     <w:nsid w:val="548E1C37"/>
     <w:multiLevelType w:val="multilevel"/>
     <w:tmpl w:val="555C307A"/>
@@ -7458,7 +8271,7 @@
       </w:pPr>
     </w:lvl>
   </w:abstractNum>
-  <w:abstractNum w:abstractNumId="17" w15:restartNumberingAfterBreak="0">
+  <w:abstractNum w:abstractNumId="18" w15:restartNumberingAfterBreak="0">
     <w:nsid w:val="56AA7D37"/>
     <w:multiLevelType w:val="multilevel"/>
     <w:tmpl w:val="F960698C"/>
@@ -7571,7 +8384,7 @@
       </w:pPr>
     </w:lvl>
   </w:abstractNum>
-  <w:abstractNum w:abstractNumId="18" w15:restartNumberingAfterBreak="0">
+  <w:abstractNum w:abstractNumId="19" w15:restartNumberingAfterBreak="0">
     <w:nsid w:val="58B8F671"/>
     <w:multiLevelType w:val="hybridMultilevel"/>
     <w:tmpl w:val="79F2AC84"/>
@@ -7657,7 +8470,7 @@
       </w:pPr>
     </w:lvl>
   </w:abstractNum>
-  <w:abstractNum w:abstractNumId="19" w15:restartNumberingAfterBreak="0">
+  <w:abstractNum w:abstractNumId="20" w15:restartNumberingAfterBreak="0">
     <w:nsid w:val="5C637E0B"/>
     <w:multiLevelType w:val="multilevel"/>
     <w:tmpl w:val="61266E18"/>
@@ -7806,7 +8619,7 @@
       </w:rPr>
     </w:lvl>
   </w:abstractNum>
-  <w:abstractNum w:abstractNumId="20" w15:restartNumberingAfterBreak="0">
+  <w:abstractNum w:abstractNumId="21" w15:restartNumberingAfterBreak="0">
     <w:nsid w:val="5D4852BC"/>
     <w:multiLevelType w:val="multilevel"/>
     <w:tmpl w:val="733C5C3C"/>
@@ -7919,7 +8732,7 @@
       </w:pPr>
     </w:lvl>
   </w:abstractNum>
-  <w:abstractNum w:abstractNumId="21" w15:restartNumberingAfterBreak="0">
+  <w:abstractNum w:abstractNumId="22" w15:restartNumberingAfterBreak="0">
     <w:nsid w:val="650246A8"/>
     <w:multiLevelType w:val="multilevel"/>
     <w:tmpl w:val="B4E2DAEE"/>
@@ -8032,7 +8845,7 @@
       </w:pPr>
     </w:lvl>
   </w:abstractNum>
-  <w:abstractNum w:abstractNumId="22" w15:restartNumberingAfterBreak="0">
+  <w:abstractNum w:abstractNumId="23" w15:restartNumberingAfterBreak="0">
     <w:nsid w:val="65885A4C"/>
     <w:multiLevelType w:val="multilevel"/>
     <w:tmpl w:val="A1D621C4"/>
@@ -8145,7 +8958,7 @@
       </w:pPr>
     </w:lvl>
   </w:abstractNum>
-  <w:abstractNum w:abstractNumId="23" w15:restartNumberingAfterBreak="0">
+  <w:abstractNum w:abstractNumId="24" w15:restartNumberingAfterBreak="0">
     <w:nsid w:val="6BC4FC0A"/>
     <w:multiLevelType w:val="hybridMultilevel"/>
     <w:tmpl w:val="8D5A53CC"/>
@@ -8231,7 +9044,7 @@
       </w:pPr>
     </w:lvl>
   </w:abstractNum>
-  <w:abstractNum w:abstractNumId="24" w15:restartNumberingAfterBreak="0">
+  <w:abstractNum w:abstractNumId="25" w15:restartNumberingAfterBreak="0">
     <w:nsid w:val="71923C52"/>
     <w:multiLevelType w:val="multilevel"/>
     <w:tmpl w:val="9AD43214"/>
@@ -8380,7 +9193,7 @@
       </w:rPr>
     </w:lvl>
   </w:abstractNum>
-  <w:abstractNum w:abstractNumId="25" w15:restartNumberingAfterBreak="0">
+  <w:abstractNum w:abstractNumId="26" w15:restartNumberingAfterBreak="0">
     <w:nsid w:val="765B5AED"/>
     <w:multiLevelType w:val="multilevel"/>
     <w:tmpl w:val="089EF80A"/>
@@ -8493,7 +9306,7 @@
       </w:pPr>
     </w:lvl>
   </w:abstractNum>
-  <w:abstractNum w:abstractNumId="26" w15:restartNumberingAfterBreak="0">
+  <w:abstractNum w:abstractNumId="27" w15:restartNumberingAfterBreak="0">
     <w:nsid w:val="7713601E"/>
     <w:multiLevelType w:val="multilevel"/>
     <w:tmpl w:val="426A7030"/>
@@ -8642,7 +9455,7 @@
       </w:rPr>
     </w:lvl>
   </w:abstractNum>
-  <w:abstractNum w:abstractNumId="27" w15:restartNumberingAfterBreak="0">
+  <w:abstractNum w:abstractNumId="28" w15:restartNumberingAfterBreak="0">
     <w:nsid w:val="773C6E28"/>
     <w:multiLevelType w:val="hybridMultilevel"/>
     <w:tmpl w:val="2E0A8F60"/>
@@ -8755,7 +9568,7 @@
       </w:rPr>
     </w:lvl>
   </w:abstractNum>
-  <w:abstractNum w:abstractNumId="28" w15:restartNumberingAfterBreak="0">
+  <w:abstractNum w:abstractNumId="29" w15:restartNumberingAfterBreak="0">
     <w:nsid w:val="785A5636"/>
     <w:multiLevelType w:val="multilevel"/>
     <w:tmpl w:val="5ECC3466"/>
@@ -8868,7 +9681,7 @@
       </w:pPr>
     </w:lvl>
   </w:abstractNum>
-  <w:abstractNum w:abstractNumId="29" w15:restartNumberingAfterBreak="0">
+  <w:abstractNum w:abstractNumId="30" w15:restartNumberingAfterBreak="0">
     <w:nsid w:val="7A00286F"/>
     <w:multiLevelType w:val="multilevel"/>
     <w:tmpl w:val="C4BABB0E"/>
@@ -9017,7 +9830,7 @@
       </w:rPr>
     </w:lvl>
   </w:abstractNum>
-  <w:abstractNum w:abstractNumId="30" w15:restartNumberingAfterBreak="0">
+  <w:abstractNum w:abstractNumId="31" w15:restartNumberingAfterBreak="0">
     <w:nsid w:val="7B8325F1"/>
     <w:multiLevelType w:val="multilevel"/>
     <w:tmpl w:val="922C4896"/>
@@ -9131,97 +9944,100 @@
     </w:lvl>
   </w:abstractNum>
   <w:num w:numId="1" w16cid:durableId="1754278210">
-    <w:abstractNumId w:val="23"/>
+    <w:abstractNumId w:val="24"/>
   </w:num>
   <w:num w:numId="2" w16cid:durableId="1751150727">
-    <w:abstractNumId w:val="18"/>
+    <w:abstractNumId w:val="19"/>
   </w:num>
   <w:num w:numId="3" w16cid:durableId="173687564">
-    <w:abstractNumId w:val="4"/>
+    <w:abstractNumId w:val="5"/>
   </w:num>
   <w:num w:numId="4" w16cid:durableId="1366641388">
-    <w:abstractNumId w:val="27"/>
+    <w:abstractNumId w:val="28"/>
   </w:num>
   <w:num w:numId="5" w16cid:durableId="1635408514">
     <w:abstractNumId w:val="0"/>
   </w:num>
   <w:num w:numId="6" w16cid:durableId="522325794">
-    <w:abstractNumId w:val="26"/>
+    <w:abstractNumId w:val="27"/>
   </w:num>
   <w:num w:numId="7" w16cid:durableId="271014127">
-    <w:abstractNumId w:val="8"/>
+    <w:abstractNumId w:val="9"/>
   </w:num>
   <w:num w:numId="8" w16cid:durableId="540215461">
-    <w:abstractNumId w:val="12"/>
+    <w:abstractNumId w:val="13"/>
   </w:num>
   <w:num w:numId="9" w16cid:durableId="1919901369">
-    <w:abstractNumId w:val="13"/>
+    <w:abstractNumId w:val="14"/>
   </w:num>
   <w:num w:numId="10" w16cid:durableId="622149979">
-    <w:abstractNumId w:val="6"/>
+    <w:abstractNumId w:val="7"/>
   </w:num>
   <w:num w:numId="11" w16cid:durableId="1056125410">
     <w:abstractNumId w:val="1"/>
   </w:num>
   <w:num w:numId="12" w16cid:durableId="1382898143">
-    <w:abstractNumId w:val="24"/>
+    <w:abstractNumId w:val="25"/>
   </w:num>
   <w:num w:numId="13" w16cid:durableId="1316186298">
-    <w:abstractNumId w:val="3"/>
+    <w:abstractNumId w:val="4"/>
   </w:num>
   <w:num w:numId="14" w16cid:durableId="1292663148">
     <w:abstractNumId w:val="2"/>
   </w:num>
   <w:num w:numId="15" w16cid:durableId="1616251814">
+    <w:abstractNumId w:val="30"/>
+  </w:num>
+  <w:num w:numId="16" w16cid:durableId="1330597207">
     <w:abstractNumId w:val="29"/>
   </w:num>
-  <w:num w:numId="16" w16cid:durableId="1330597207">
-    <w:abstractNumId w:val="28"/>
+  <w:num w:numId="17" w16cid:durableId="1208568063">
+    <w:abstractNumId w:val="18"/>
   </w:num>
-  <w:num w:numId="17" w16cid:durableId="1208568063">
+  <w:num w:numId="18" w16cid:durableId="235557561">
+    <w:abstractNumId w:val="8"/>
+  </w:num>
+  <w:num w:numId="19" w16cid:durableId="899364305">
+    <w:abstractNumId w:val="10"/>
+  </w:num>
+  <w:num w:numId="20" w16cid:durableId="1942835317">
+    <w:abstractNumId w:val="11"/>
+  </w:num>
+  <w:num w:numId="21" w16cid:durableId="849106107">
+    <w:abstractNumId w:val="22"/>
+  </w:num>
+  <w:num w:numId="22" w16cid:durableId="1992831624">
+    <w:abstractNumId w:val="21"/>
+  </w:num>
+  <w:num w:numId="23" w16cid:durableId="284653594">
     <w:abstractNumId w:val="17"/>
   </w:num>
-  <w:num w:numId="18" w16cid:durableId="235557561">
-    <w:abstractNumId w:val="7"/>
+  <w:num w:numId="24" w16cid:durableId="369041275">
+    <w:abstractNumId w:val="15"/>
   </w:num>
-  <w:num w:numId="19" w16cid:durableId="899364305">
-    <w:abstractNumId w:val="9"/>
+  <w:num w:numId="25" w16cid:durableId="190578826">
+    <w:abstractNumId w:val="31"/>
   </w:num>
-  <w:num w:numId="20" w16cid:durableId="1942835317">
-    <w:abstractNumId w:val="10"/>
+  <w:num w:numId="26" w16cid:durableId="1933274866">
+    <w:abstractNumId w:val="16"/>
   </w:num>
-  <w:num w:numId="21" w16cid:durableId="849106107">
-    <w:abstractNumId w:val="21"/>
+  <w:num w:numId="27" w16cid:durableId="1980918539">
+    <w:abstractNumId w:val="6"/>
   </w:num>
-  <w:num w:numId="22" w16cid:durableId="1992831624">
+  <w:num w:numId="28" w16cid:durableId="1631547609">
+    <w:abstractNumId w:val="23"/>
+  </w:num>
+  <w:num w:numId="29" w16cid:durableId="704674926">
+    <w:abstractNumId w:val="26"/>
+  </w:num>
+  <w:num w:numId="30" w16cid:durableId="170147078">
     <w:abstractNumId w:val="20"/>
   </w:num>
-  <w:num w:numId="23" w16cid:durableId="284653594">
-    <w:abstractNumId w:val="16"/>
+  <w:num w:numId="31" w16cid:durableId="1848055955">
+    <w:abstractNumId w:val="12"/>
   </w:num>
-  <w:num w:numId="24" w16cid:durableId="369041275">
-    <w:abstractNumId w:val="14"/>
-  </w:num>
-  <w:num w:numId="25" w16cid:durableId="190578826">
-    <w:abstractNumId w:val="30"/>
-  </w:num>
-  <w:num w:numId="26" w16cid:durableId="1933274866">
-    <w:abstractNumId w:val="15"/>
-  </w:num>
-  <w:num w:numId="27" w16cid:durableId="1980918539">
-    <w:abstractNumId w:val="5"/>
-  </w:num>
-  <w:num w:numId="28" w16cid:durableId="1631547609">
-    <w:abstractNumId w:val="22"/>
-  </w:num>
-  <w:num w:numId="29" w16cid:durableId="704674926">
-    <w:abstractNumId w:val="25"/>
-  </w:num>
-  <w:num w:numId="30" w16cid:durableId="170147078">
-    <w:abstractNumId w:val="19"/>
-  </w:num>
-  <w:num w:numId="31" w16cid:durableId="1848055955">
-    <w:abstractNumId w:val="11"/>
+  <w:num w:numId="32" w16cid:durableId="655499870">
+    <w:abstractNumId w:val="3"/>
   </w:num>
 </w:numbering>
 </file>
@@ -9669,7 +10485,6 @@
   <w:style w:type="character" w:default="1" w:styleId="Fuentedeprrafopredeter">
     <w:name w:val="Default Paragraph Font"/>
     <w:uiPriority w:val="1"/>
-    <w:semiHidden/>
     <w:unhideWhenUsed/>
   </w:style>
   <w:style w:type="table" w:default="1" w:styleId="Tablanormal">

</xml_diff>

<commit_message>
Archivo config + inserts actualizados a 10/3/2025 + script para buscar jugadores temporales
Con jugadores temporales me refiero a jugadores que o han sido fichados o convocados recientemente o que tienen un contrato temporal.
</commit_message>
<xml_diff>
--- a/docs/PROYECTO TFG.docx
+++ b/docs/PROYECTO TFG.docx
@@ -8042,13 +8042,41 @@
           <w:rFonts w:ascii="Arial" w:hAnsi="Arial" w:cs="Arial"/>
         </w:rPr>
         <w:tab/>
+      </w:r>
+      <w:r>
+        <w:rPr>
+          <w:rFonts w:ascii="Arial" w:hAnsi="Arial" w:cs="Arial"/>
+          <w:color w:val="FF0000"/>
+        </w:rPr>
         <w:t>0061</w:t>
       </w:r>
       <w:r>
         <w:rPr>
           <w:rFonts w:ascii="Arial" w:hAnsi="Arial" w:cs="Arial"/>
-        </w:rPr>
-        <w:t>-1200</w:t>
+          <w:color w:val="FF0000"/>
+        </w:rPr>
+        <w:t xml:space="preserve"> hasta </w:t>
+      </w:r>
+      <w:r>
+        <w:rPr>
+          <w:rFonts w:ascii="Arial" w:hAnsi="Arial" w:cs="Arial"/>
+          <w:color w:val="FF0000"/>
+        </w:rPr>
+        <w:t>12</w:t>
+      </w:r>
+      <w:r>
+        <w:rPr>
+          <w:rFonts w:ascii="Arial" w:hAnsi="Arial" w:cs="Arial"/>
+          <w:color w:val="FF0000"/>
+        </w:rPr>
+        <w:t>9</w:t>
+      </w:r>
+      <w:r>
+        <w:rPr>
+          <w:rFonts w:ascii="Arial" w:hAnsi="Arial" w:cs="Arial"/>
+          <w:color w:val="FF0000"/>
+        </w:rPr>
+        <w:t>0</w:t>
       </w:r>
     </w:p>
     <w:p>
@@ -8066,7 +8094,7 @@
           <w:sz w:val="22"/>
           <w:szCs w:val="22"/>
         </w:rPr>
-        <w:t>Temporada regular</w:t>
+        <w:t>Tipo de competición (002 temporada regular)</w:t>
       </w:r>
       <w:r>
         <w:rPr>
@@ -8083,7 +8111,15 @@
           <w:sz w:val="22"/>
           <w:szCs w:val="22"/>
         </w:rPr>
-        <w:t xml:space="preserve">- </w:t>
+        <w:t>–</w:t>
+      </w:r>
+      <w:r>
+        <w:rPr>
+          <w:rFonts w:ascii="Arial" w:hAnsi="Arial" w:cs="Arial"/>
+          <w:sz w:val="22"/>
+          <w:szCs w:val="22"/>
+        </w:rPr>
+        <w:t xml:space="preserve"> </w:t>
       </w:r>
       <w:r>
         <w:rPr>
@@ -8092,7 +8128,7 @@
           <w:sz w:val="22"/>
           <w:szCs w:val="22"/>
         </w:rPr>
-        <w:t>año temporada</w:t>
+        <w:t>año</w:t>
       </w:r>
       <w:r>
         <w:rPr>
@@ -8101,33 +8137,33 @@
           <w:sz w:val="22"/>
           <w:szCs w:val="22"/>
         </w:rPr>
-        <w:t xml:space="preserve"> </w:t>
-      </w:r>
-      <w:r>
-        <w:rPr>
-          <w:rFonts w:ascii="Arial" w:hAnsi="Arial" w:cs="Arial"/>
+        <w:t xml:space="preserve"> que comienza la</w:t>
+      </w:r>
+      <w:r>
+        <w:rPr>
+          <w:rFonts w:ascii="Arial" w:hAnsi="Arial" w:cs="Arial"/>
+          <w:color w:val="501549" w:themeColor="accent5" w:themeShade="80"/>
           <w:sz w:val="22"/>
           <w:szCs w:val="22"/>
         </w:rPr>
-        <w:t xml:space="preserve">– prefijo - </w:t>
-      </w:r>
-      <w:proofErr w:type="spellStart"/>
-      <w:r>
-        <w:rPr>
-          <w:rFonts w:ascii="Arial" w:hAnsi="Arial" w:cs="Arial"/>
+        <w:t xml:space="preserve"> temporada</w:t>
+      </w:r>
+      <w:r>
+        <w:rPr>
+          <w:rFonts w:ascii="Arial" w:hAnsi="Arial" w:cs="Arial"/>
+          <w:color w:val="501549" w:themeColor="accent5" w:themeShade="80"/>
           <w:sz w:val="22"/>
           <w:szCs w:val="22"/>
         </w:rPr>
-        <w:t>nº</w:t>
-      </w:r>
-      <w:proofErr w:type="spellEnd"/>
+        <w:t xml:space="preserve"> </w:t>
+      </w:r>
       <w:r>
         <w:rPr>
           <w:rFonts w:ascii="Arial" w:hAnsi="Arial" w:cs="Arial"/>
           <w:sz w:val="22"/>
           <w:szCs w:val="22"/>
         </w:rPr>
-        <w:t xml:space="preserve"> </w:t>
+        <w:t>-</w:t>
       </w:r>
       <w:r>
         <w:rPr>
@@ -8135,7 +8171,7 @@
           <w:sz w:val="22"/>
           <w:szCs w:val="22"/>
         </w:rPr>
-        <w:t>partido</w:t>
+        <w:t xml:space="preserve"> prefijo </w:t>
       </w:r>
       <w:r>
         <w:rPr>
@@ -8143,7 +8179,7 @@
           <w:sz w:val="22"/>
           <w:szCs w:val="22"/>
         </w:rPr>
-        <w:t xml:space="preserve"> (empieza siempre por el 61</w:t>
+        <w:t>–</w:t>
       </w:r>
       <w:r>
         <w:rPr>
@@ -8151,202 +8187,276 @@
           <w:sz w:val="22"/>
           <w:szCs w:val="22"/>
         </w:rPr>
-        <w:t>)</w:t>
-      </w:r>
-    </w:p>
-    <w:p>
-      <w:pPr>
-        <w:rPr>
-          <w:rFonts w:ascii="Arial" w:hAnsi="Arial" w:cs="Arial"/>
+        <w:t xml:space="preserve"> </w:t>
+      </w:r>
+    </w:p>
+    <w:p>
+      <w:pPr>
+        <w:rPr>
+          <w:rFonts w:ascii="Arial" w:hAnsi="Arial" w:cs="Arial"/>
+          <w:color w:val="FF0000"/>
           <w:sz w:val="22"/>
           <w:szCs w:val="22"/>
         </w:rPr>
       </w:pPr>
-      <w:r>
-        <w:rPr>
-          <w:rFonts w:ascii="Arial" w:hAnsi="Arial" w:cs="Arial"/>
+      <w:proofErr w:type="spellStart"/>
+      <w:r>
+        <w:rPr>
+          <w:rFonts w:ascii="Arial" w:hAnsi="Arial" w:cs="Arial"/>
+          <w:color w:val="FF0000"/>
           <w:sz w:val="22"/>
           <w:szCs w:val="22"/>
         </w:rPr>
-        <w:t>Lo normal es que los partidos vayan del 0001 al 1230 (82 partidos cada equipo)</w:t>
-      </w:r>
-      <w:r>
-        <w:rPr>
-          <w:rFonts w:ascii="Arial" w:hAnsi="Arial" w:cs="Arial"/>
+        <w:t>nº</w:t>
+      </w:r>
+      <w:proofErr w:type="spellEnd"/>
+      <w:r>
+        <w:rPr>
+          <w:rFonts w:ascii="Arial" w:hAnsi="Arial" w:cs="Arial"/>
+          <w:color w:val="FF0000"/>
           <w:sz w:val="22"/>
           <w:szCs w:val="22"/>
         </w:rPr>
-        <w:t>.</w:t>
-      </w:r>
-    </w:p>
-    <w:p>
-      <w:pPr>
-        <w:rPr>
-          <w:rFonts w:ascii="Arial" w:hAnsi="Arial" w:cs="Arial"/>
+        <w:t xml:space="preserve"> </w:t>
+      </w:r>
+      <w:r>
+        <w:rPr>
+          <w:rFonts w:ascii="Arial" w:hAnsi="Arial" w:cs="Arial"/>
+          <w:color w:val="FF0000"/>
           <w:sz w:val="22"/>
           <w:szCs w:val="22"/>
         </w:rPr>
-      </w:pPr>
-      <w:r>
-        <w:rPr>
-          <w:rFonts w:ascii="Arial" w:hAnsi="Arial" w:cs="Arial"/>
+        <w:t>partido</w:t>
+      </w:r>
+      <w:r>
+        <w:rPr>
+          <w:rFonts w:ascii="Arial" w:hAnsi="Arial" w:cs="Arial"/>
+          <w:color w:val="FF0000"/>
           <w:sz w:val="22"/>
           <w:szCs w:val="22"/>
         </w:rPr>
-        <w:t>Pero desde que añadieron la competición de la NBA Cup, que se juega entre medias de la temporada regular, han cambiado los id y orden de los partidos.</w:t>
-      </w:r>
-    </w:p>
-    <w:p>
-      <w:pPr>
-        <w:rPr>
-          <w:rFonts w:ascii="Arial" w:hAnsi="Arial" w:cs="Arial"/>
+        <w:t xml:space="preserve"> (empieza </w:t>
+      </w:r>
+      <w:r>
+        <w:rPr>
+          <w:rFonts w:ascii="Arial" w:hAnsi="Arial" w:cs="Arial"/>
+          <w:color w:val="FF0000"/>
           <w:sz w:val="22"/>
           <w:szCs w:val="22"/>
         </w:rPr>
-      </w:pPr>
-      <w:r>
-        <w:rPr>
-          <w:rFonts w:ascii="Arial" w:hAnsi="Arial" w:cs="Arial"/>
+        <w:t>este año</w:t>
+      </w:r>
+      <w:r>
+        <w:rPr>
+          <w:rFonts w:ascii="Arial" w:hAnsi="Arial" w:cs="Arial"/>
+          <w:color w:val="FF0000"/>
           <w:sz w:val="22"/>
           <w:szCs w:val="22"/>
         </w:rPr>
-        <w:t>En la temporada 23/24 a partir del id 1231 eran partidos de la NBA Cup.</w:t>
-      </w:r>
-    </w:p>
-    <w:p>
-      <w:pPr>
-        <w:rPr>
-          <w:rFonts w:ascii="Arial" w:hAnsi="Arial" w:cs="Arial"/>
+        <w:t xml:space="preserve"> por el 61</w:t>
+      </w:r>
+      <w:r>
+        <w:rPr>
+          <w:rFonts w:ascii="Arial" w:hAnsi="Arial" w:cs="Arial"/>
+          <w:color w:val="FF0000"/>
           <w:sz w:val="22"/>
           <w:szCs w:val="22"/>
         </w:rPr>
-      </w:pPr>
-      <w:r>
+        <w:t>)</w:t>
+      </w:r>
+    </w:p>
+    <w:p>
+      <w:pPr>
         <w:rPr>
           <w:rFonts w:ascii="Arial" w:hAnsi="Arial" w:cs="Arial"/>
           <w:sz w:val="22"/>
           <w:szCs w:val="22"/>
         </w:rPr>
-        <w:t xml:space="preserve">Esta temporada 24/25 </w:t>
-      </w:r>
+      </w:pPr>
       <w:r>
         <w:rPr>
           <w:rFonts w:ascii="Arial" w:hAnsi="Arial" w:cs="Arial"/>
           <w:sz w:val="22"/>
           <w:szCs w:val="22"/>
         </w:rPr>
-        <w:t xml:space="preserve">los partidos de la NBA Cup van del 0001 al 0060, por </w:t>
-      </w:r>
-      <w:proofErr w:type="gramStart"/>
+        <w:t>Lo normal es que los partidos vayan del 0001 al 1230 (82 partidos cada equipo)</w:t>
+      </w:r>
       <w:r>
         <w:rPr>
           <w:rFonts w:ascii="Arial" w:hAnsi="Arial" w:cs="Arial"/>
           <w:sz w:val="22"/>
           <w:szCs w:val="22"/>
         </w:rPr>
-        <w:t>tanto</w:t>
-      </w:r>
-      <w:proofErr w:type="gramEnd"/>
-      <w:r>
+        <w:t>.</w:t>
+      </w:r>
+    </w:p>
+    <w:p>
+      <w:pPr>
         <w:rPr>
           <w:rFonts w:ascii="Arial" w:hAnsi="Arial" w:cs="Arial"/>
           <w:sz w:val="22"/>
           <w:szCs w:val="22"/>
         </w:rPr>
-        <w:t xml:space="preserve"> los de la temporada regular van</w:t>
-      </w:r>
+      </w:pPr>
       <w:r>
         <w:rPr>
           <w:rFonts w:ascii="Arial" w:hAnsi="Arial" w:cs="Arial"/>
           <w:sz w:val="22"/>
           <w:szCs w:val="22"/>
         </w:rPr>
-        <w:t xml:space="preserve"> del 0061 al 1290</w:t>
-      </w:r>
-      <w:r>
+        <w:t>Pero desde que añadieron la competición de la NBA Cup, que se juega entre medias de la temporada regular, han cambiado los id y orden de los partidos.</w:t>
+      </w:r>
+    </w:p>
+    <w:p>
+      <w:pPr>
         <w:rPr>
           <w:rFonts w:ascii="Arial" w:hAnsi="Arial" w:cs="Arial"/>
           <w:sz w:val="22"/>
           <w:szCs w:val="22"/>
         </w:rPr>
-        <w:t>.</w:t>
-      </w:r>
-    </w:p>
-    <w:p>
-      <w:pPr>
+      </w:pPr>
+      <w:r>
         <w:rPr>
           <w:rFonts w:ascii="Arial" w:hAnsi="Arial" w:cs="Arial"/>
           <w:sz w:val="22"/>
           <w:szCs w:val="22"/>
         </w:rPr>
-      </w:pPr>
-      <w:r>
+        <w:t>En la temporada 23/24 a partir del id 1231 eran partidos de la NBA Cup.</w:t>
+      </w:r>
+    </w:p>
+    <w:p>
+      <w:pPr>
         <w:rPr>
           <w:rFonts w:ascii="Arial" w:hAnsi="Arial" w:cs="Arial"/>
           <w:sz w:val="22"/>
           <w:szCs w:val="22"/>
         </w:rPr>
-        <w:t>Esperemos que en las próximas temporadas se mantenga así</w:t>
-      </w:r>
+      </w:pPr>
       <w:r>
         <w:rPr>
           <w:rFonts w:ascii="Arial" w:hAnsi="Arial" w:cs="Arial"/>
           <w:sz w:val="22"/>
           <w:szCs w:val="22"/>
         </w:rPr>
-        <w:t>.</w:t>
-      </w:r>
-    </w:p>
-    <w:p>
-      <w:pPr>
+        <w:t xml:space="preserve">Esta temporada 24/25 </w:t>
+      </w:r>
+      <w:r>
         <w:rPr>
           <w:rFonts w:ascii="Arial" w:hAnsi="Arial" w:cs="Arial"/>
           <w:sz w:val="22"/>
           <w:szCs w:val="22"/>
         </w:rPr>
-      </w:pPr>
-    </w:p>
-    <w:p>
-      <w:pPr>
+        <w:t xml:space="preserve">los partidos de la NBA Cup van del 0001 al 0060, por </w:t>
+      </w:r>
+      <w:proofErr w:type="gramStart"/>
+      <w:r>
         <w:rPr>
           <w:rFonts w:ascii="Arial" w:hAnsi="Arial" w:cs="Arial"/>
           <w:sz w:val="22"/>
           <w:szCs w:val="22"/>
         </w:rPr>
-      </w:pPr>
+        <w:t>tanto</w:t>
+      </w:r>
+      <w:proofErr w:type="gramEnd"/>
       <w:r>
         <w:rPr>
           <w:rFonts w:ascii="Arial" w:hAnsi="Arial" w:cs="Arial"/>
           <w:sz w:val="22"/>
           <w:szCs w:val="22"/>
         </w:rPr>
-        <w:t>Una vez explicado esto ya podemos ver cómo he conseguido importar los datos:</w:t>
-      </w:r>
-    </w:p>
-    <w:p>
-      <w:pPr>
+        <w:t xml:space="preserve"> los de la temporada regular van</w:t>
+      </w:r>
+      <w:r>
         <w:rPr>
           <w:rFonts w:ascii="Arial" w:hAnsi="Arial" w:cs="Arial"/>
           <w:sz w:val="22"/>
           <w:szCs w:val="22"/>
         </w:rPr>
-      </w:pPr>
-    </w:p>
-    <w:p>
-      <w:pPr>
+        <w:t xml:space="preserve"> del 0061 al 1290</w:t>
+      </w:r>
+      <w:r>
         <w:rPr>
           <w:rFonts w:ascii="Arial" w:hAnsi="Arial" w:cs="Arial"/>
           <w:sz w:val="22"/>
           <w:szCs w:val="22"/>
         </w:rPr>
-      </w:pPr>
-      <w:r>
+        <w:t>.</w:t>
+      </w:r>
+    </w:p>
+    <w:p>
+      <w:pPr>
         <w:rPr>
           <w:rFonts w:ascii="Arial" w:hAnsi="Arial" w:cs="Arial"/>
           <w:sz w:val="22"/>
           <w:szCs w:val="22"/>
         </w:rPr>
-        <w:lastRenderedPageBreak/>
+      </w:pPr>
+      <w:r>
+        <w:rPr>
+          <w:rFonts w:ascii="Arial" w:hAnsi="Arial" w:cs="Arial"/>
+          <w:sz w:val="22"/>
+          <w:szCs w:val="22"/>
+        </w:rPr>
+        <w:t>Esperemos que en las próximas temporadas se mantenga así</w:t>
+      </w:r>
+      <w:r>
+        <w:rPr>
+          <w:rFonts w:ascii="Arial" w:hAnsi="Arial" w:cs="Arial"/>
+          <w:sz w:val="22"/>
+          <w:szCs w:val="22"/>
+        </w:rPr>
+        <w:t>.</w:t>
+      </w:r>
+    </w:p>
+    <w:p>
+      <w:pPr>
+        <w:rPr>
+          <w:rFonts w:ascii="Arial" w:hAnsi="Arial" w:cs="Arial"/>
+          <w:sz w:val="22"/>
+          <w:szCs w:val="22"/>
+        </w:rPr>
+      </w:pPr>
+    </w:p>
+    <w:p>
+      <w:pPr>
+        <w:rPr>
+          <w:rFonts w:ascii="Arial" w:hAnsi="Arial" w:cs="Arial"/>
+          <w:sz w:val="22"/>
+          <w:szCs w:val="22"/>
+        </w:rPr>
+      </w:pPr>
+      <w:r>
+        <w:rPr>
+          <w:rFonts w:ascii="Arial" w:hAnsi="Arial" w:cs="Arial"/>
+          <w:sz w:val="22"/>
+          <w:szCs w:val="22"/>
+        </w:rPr>
+        <w:t>Una vez explicado esto ya podemos ver cómo he conseguido importar los datos:</w:t>
+      </w:r>
+    </w:p>
+    <w:p>
+      <w:pPr>
+        <w:rPr>
+          <w:rFonts w:ascii="Arial" w:hAnsi="Arial" w:cs="Arial"/>
+          <w:sz w:val="22"/>
+          <w:szCs w:val="22"/>
+        </w:rPr>
+      </w:pPr>
+    </w:p>
+    <w:p>
+      <w:pPr>
+        <w:rPr>
+          <w:rFonts w:ascii="Arial" w:hAnsi="Arial" w:cs="Arial"/>
+          <w:sz w:val="22"/>
+          <w:szCs w:val="22"/>
+        </w:rPr>
+      </w:pPr>
+      <w:r>
+        <w:rPr>
+          <w:rFonts w:ascii="Arial" w:hAnsi="Arial" w:cs="Arial"/>
+          <w:sz w:val="22"/>
+          <w:szCs w:val="22"/>
+        </w:rPr>
         <w:t xml:space="preserve">Utilizando el </w:t>
       </w:r>
       <w:proofErr w:type="spellStart"/>
@@ -9035,6 +9145,15 @@
           <w:szCs w:val="20"/>
         </w:rPr>
       </w:pPr>
+    </w:p>
+    <w:p>
+      <w:pPr>
+        <w:rPr>
+          <w:rFonts w:ascii="Arial" w:hAnsi="Arial" w:cs="Arial"/>
+          <w:sz w:val="20"/>
+          <w:szCs w:val="20"/>
+        </w:rPr>
+      </w:pPr>
       <w:r>
         <w:rPr>
           <w:rFonts w:ascii="Arial" w:hAnsi="Arial" w:cs="Arial"/>
@@ -9260,6 +9379,90 @@
         </w:rPr>
         <w:t>” todas las estadísticas indican el promedio del jugador.</w:t>
       </w:r>
+    </w:p>
+    <w:p>
+      <w:pPr>
+        <w:rPr>
+          <w:rFonts w:ascii="Arial" w:hAnsi="Arial" w:cs="Arial"/>
+        </w:rPr>
+      </w:pPr>
+      <w:r>
+        <w:rPr>
+          <w:rFonts w:ascii="Arial" w:hAnsi="Arial" w:cs="Arial"/>
+        </w:rPr>
+        <w:t>Hay jugadores que en algunos partidos aparezcan y se muestren las estadísticas que han tenido en ese partido, pero sin embargo no tienen estadísticas promedio.</w:t>
+      </w:r>
+    </w:p>
+    <w:p>
+      <w:pPr>
+        <w:rPr>
+          <w:rFonts w:ascii="Arial" w:hAnsi="Arial" w:cs="Arial"/>
+        </w:rPr>
+      </w:pPr>
+      <w:r>
+        <w:rPr>
+          <w:rFonts w:ascii="Arial" w:hAnsi="Arial" w:cs="Arial"/>
+        </w:rPr>
+        <w:t xml:space="preserve">Esto se debe a </w:t>
+      </w:r>
+      <w:proofErr w:type="gramStart"/>
+      <w:r>
+        <w:rPr>
+          <w:rFonts w:ascii="Arial" w:hAnsi="Arial" w:cs="Arial"/>
+        </w:rPr>
+        <w:t>que</w:t>
+      </w:r>
+      <w:proofErr w:type="gramEnd"/>
+      <w:r>
+        <w:rPr>
+          <w:rFonts w:ascii="Arial" w:hAnsi="Arial" w:cs="Arial"/>
+        </w:rPr>
+        <w:t xml:space="preserve"> s</w:t>
+      </w:r>
+      <w:r>
+        <w:rPr>
+          <w:rFonts w:ascii="Arial" w:hAnsi="Arial" w:cs="Arial"/>
+        </w:rPr>
+        <w:t>i un jugador ha jugado s</w:t>
+      </w:r>
+      <w:r>
+        <w:rPr>
+          <w:rFonts w:ascii="Arial" w:hAnsi="Arial" w:cs="Arial"/>
+        </w:rPr>
+        <w:t>o</w:t>
+      </w:r>
+      <w:r>
+        <w:rPr>
+          <w:rFonts w:ascii="Arial" w:hAnsi="Arial" w:cs="Arial"/>
+        </w:rPr>
+        <w:t>lo uno o dos partidos, sus promedios pueden variar mucho y no ofrecer una comparación justa con quienes han participado durante la temporada completa. Por ello, se excluyen automáticamente a aquellos que no alcanzan ese mínimo de participación.</w:t>
+      </w:r>
+    </w:p>
+    <w:p>
+      <w:pPr>
+        <w:rPr>
+          <w:rFonts w:ascii="Arial" w:hAnsi="Arial" w:cs="Arial"/>
+        </w:rPr>
+      </w:pPr>
+      <w:r>
+        <w:rPr>
+          <w:rFonts w:ascii="Arial" w:hAnsi="Arial" w:cs="Arial"/>
+        </w:rPr>
+        <w:t>Para</w:t>
+      </w:r>
+      <w:r>
+        <w:rPr>
+          <w:rFonts w:ascii="Arial" w:hAnsi="Arial" w:cs="Arial"/>
+        </w:rPr>
+        <w:t xml:space="preserve"> que un jugador aparezca en ciertas listas o promedios, debe haber jugado una cantidad mínima de partidos o minutos.</w:t>
+      </w:r>
+    </w:p>
+    <w:p>
+      <w:pPr>
+        <w:rPr>
+          <w:rFonts w:ascii="Arial" w:hAnsi="Arial" w:cs="Arial"/>
+        </w:rPr>
+      </w:pPr>
     </w:p>
     <w:p>
       <w:pPr>

</xml_diff>

<commit_message>
Refactoring de routes - División por microservicio
Se han creado las carpetas de los distintos microservicios y usado blueprints para manejarlo y dividirlo de forma organizada. Aún así queda un routes común para algunos endpoints específicos o auxiliares para la aplicación.
</commit_message>
<xml_diff>
--- a/docs/PROYECTO TFG.docx
+++ b/docs/PROYECTO TFG.docx
@@ -1762,7 +1762,21 @@
         <w:rPr>
           <w:rFonts w:ascii="Arial" w:hAnsi="Arial" w:cs="Arial"/>
         </w:rPr>
-        <w:t>, especialmente al mostrar las probabilidades de partidos y los detalles de jugadores.</w:t>
+        <w:t xml:space="preserve">, </w:t>
+      </w:r>
+      <w:proofErr w:type="gramStart"/>
+      <w:r>
+        <w:rPr>
+          <w:rFonts w:ascii="Arial" w:hAnsi="Arial" w:cs="Arial"/>
+        </w:rPr>
+        <w:t>especialmente</w:t>
+      </w:r>
+      <w:proofErr w:type="gramEnd"/>
+      <w:r>
+        <w:rPr>
+          <w:rFonts w:ascii="Arial" w:hAnsi="Arial" w:cs="Arial"/>
+        </w:rPr>
+        <w:t xml:space="preserve"> al mostrar las probabilidades de partidos y los detalles de jugadores.</w:t>
       </w:r>
     </w:p>
     <w:p>
@@ -4498,8 +4512,19 @@
           <w:szCs w:val="20"/>
           <w:lang w:val="en-GB"/>
         </w:rPr>
-        <w:t xml:space="preserve"> } from 'react';</w:t>
-      </w:r>
+        <w:t xml:space="preserve"> } from 'react</w:t>
+      </w:r>
+      <w:proofErr w:type="gramStart"/>
+      <w:r>
+        <w:rPr>
+          <w:rFonts w:ascii="Arial" w:hAnsi="Arial" w:cs="Arial"/>
+          <w:sz w:val="20"/>
+          <w:szCs w:val="20"/>
+          <w:lang w:val="en-GB"/>
+        </w:rPr>
+        <w:t>';</w:t>
+      </w:r>
+      <w:proofErr w:type="gramEnd"/>
     </w:p>
     <w:p>
       <w:pPr>
@@ -4884,8 +4909,19 @@
           <w:szCs w:val="20"/>
           <w:lang w:val="en-GB"/>
         </w:rPr>
-        <w:t>();</w:t>
-      </w:r>
+        <w:t>(</w:t>
+      </w:r>
+      <w:proofErr w:type="gramStart"/>
+      <w:r>
+        <w:rPr>
+          <w:rFonts w:ascii="Arial" w:hAnsi="Arial" w:cs="Arial"/>
+          <w:sz w:val="20"/>
+          <w:szCs w:val="20"/>
+          <w:lang w:val="en-GB"/>
+        </w:rPr>
+        <w:t>);</w:t>
+      </w:r>
+      <w:proofErr w:type="gramEnd"/>
     </w:p>
     <w:p>
       <w:pPr>
@@ -4937,16 +4973,16 @@
         <w:t>data.prediction</w:t>
       </w:r>
       <w:proofErr w:type="spellEnd"/>
+      <w:r>
+        <w:rPr>
+          <w:rFonts w:ascii="Arial" w:hAnsi="Arial" w:cs="Arial"/>
+          <w:sz w:val="20"/>
+          <w:szCs w:val="20"/>
+          <w:lang w:val="en-GB"/>
+        </w:rPr>
+        <w:t>);</w:t>
+      </w:r>
       <w:proofErr w:type="gramEnd"/>
-      <w:r>
-        <w:rPr>
-          <w:rFonts w:ascii="Arial" w:hAnsi="Arial" w:cs="Arial"/>
-          <w:sz w:val="20"/>
-          <w:szCs w:val="20"/>
-          <w:lang w:val="en-GB"/>
-        </w:rPr>
-        <w:t>);</w:t>
-      </w:r>
     </w:p>
     <w:p>
       <w:pPr>
@@ -5051,27 +5087,7 @@
           <w:szCs w:val="20"/>
           <w:lang w:val="en-GB"/>
         </w:rPr>
-        <w:t xml:space="preserve">      &lt;h1&gt;</w:t>
-      </w:r>
-      <w:proofErr w:type="spellStart"/>
-      <w:r>
-        <w:rPr>
-          <w:rFonts w:ascii="Arial" w:hAnsi="Arial" w:cs="Arial"/>
-          <w:sz w:val="20"/>
-          <w:szCs w:val="20"/>
-          <w:lang w:val="en-GB"/>
-        </w:rPr>
-        <w:t>Predicción</w:t>
-      </w:r>
-      <w:proofErr w:type="spellEnd"/>
-      <w:r>
-        <w:rPr>
-          <w:rFonts w:ascii="Arial" w:hAnsi="Arial" w:cs="Arial"/>
-          <w:sz w:val="20"/>
-          <w:szCs w:val="20"/>
-          <w:lang w:val="en-GB"/>
-        </w:rPr>
-        <w:t xml:space="preserve"> NBA&lt;/h1&gt;</w:t>
+        <w:t xml:space="preserve">      &lt;h1&gt;Predicción NBA&lt;/h1&gt;</w:t>
       </w:r>
     </w:p>
     <w:p>
@@ -5130,27 +5146,7 @@
           <w:szCs w:val="20"/>
           <w:lang w:val="en-GB"/>
         </w:rPr>
-        <w:t xml:space="preserve">}&gt;Hacer </w:t>
-      </w:r>
-      <w:proofErr w:type="spellStart"/>
-      <w:r>
-        <w:rPr>
-          <w:rFonts w:ascii="Arial" w:hAnsi="Arial" w:cs="Arial"/>
-          <w:sz w:val="20"/>
-          <w:szCs w:val="20"/>
-          <w:lang w:val="en-GB"/>
-        </w:rPr>
-        <w:t>Predicción</w:t>
-      </w:r>
-      <w:proofErr w:type="spellEnd"/>
-      <w:r>
-        <w:rPr>
-          <w:rFonts w:ascii="Arial" w:hAnsi="Arial" w:cs="Arial"/>
-          <w:sz w:val="20"/>
-          <w:szCs w:val="20"/>
-          <w:lang w:val="en-GB"/>
-        </w:rPr>
-        <w:t>&lt;/button&gt;</w:t>
+        <w:t>}&gt;Hacer Predicción&lt;/button&gt;</w:t>
       </w:r>
     </w:p>
     <w:p>
@@ -5901,7 +5897,7 @@
           <w:sz w:val="20"/>
           <w:szCs w:val="20"/>
         </w:rPr>
-        <w:t>CORS(</w:t>
+        <w:t>CORS(app)  #</w:t>
       </w:r>
       <w:proofErr w:type="gramEnd"/>
       <w:r>
@@ -5910,7 +5906,7 @@
           <w:sz w:val="20"/>
           <w:szCs w:val="20"/>
         </w:rPr>
-        <w:t>app)  # Esto habilita CORS en todas las rutas</w:t>
+        <w:t xml:space="preserve"> Esto habilita CORS en todas las rutas</w:t>
       </w:r>
     </w:p>
     <w:p>
@@ -7365,15 +7361,31 @@
           <w:rFonts w:ascii="Arial" w:hAnsi="Arial" w:cs="Arial"/>
           <w:lang w:val="en-GB"/>
         </w:rPr>
-        <w:t>_all</w:t>
-      </w:r>
-      <w:proofErr w:type="spellEnd"/>
-      <w:r>
-        <w:rPr>
-          <w:rFonts w:ascii="Arial" w:hAnsi="Arial" w:cs="Arial"/>
-          <w:lang w:val="en-GB"/>
-        </w:rPr>
-        <w:t>()</w:t>
+        <w:t>_</w:t>
+      </w:r>
+      <w:proofErr w:type="gramStart"/>
+      <w:r>
+        <w:rPr>
+          <w:rFonts w:ascii="Arial" w:hAnsi="Arial" w:cs="Arial"/>
+          <w:lang w:val="en-GB"/>
+        </w:rPr>
+        <w:t>all</w:t>
+      </w:r>
+      <w:proofErr w:type="spellEnd"/>
+      <w:r>
+        <w:rPr>
+          <w:rFonts w:ascii="Arial" w:hAnsi="Arial" w:cs="Arial"/>
+          <w:lang w:val="en-GB"/>
+        </w:rPr>
+        <w:t>(</w:t>
+      </w:r>
+      <w:proofErr w:type="gramEnd"/>
+      <w:r>
+        <w:rPr>
+          <w:rFonts w:ascii="Arial" w:hAnsi="Arial" w:cs="Arial"/>
+          <w:lang w:val="en-GB"/>
+        </w:rPr>
+        <w:t>)</w:t>
       </w:r>
       <w:r>
         <w:rPr>
@@ -7388,7 +7400,23 @@
           <w:lang w:val="en-GB"/>
         </w:rPr>
         <w:tab/>
-        <w:t>-- exit()</w:t>
+        <w:t xml:space="preserve">-- </w:t>
+      </w:r>
+      <w:proofErr w:type="gramStart"/>
+      <w:r>
+        <w:rPr>
+          <w:rFonts w:ascii="Arial" w:hAnsi="Arial" w:cs="Arial"/>
+          <w:lang w:val="en-GB"/>
+        </w:rPr>
+        <w:t>exit(</w:t>
+      </w:r>
+      <w:proofErr w:type="gramEnd"/>
+      <w:r>
+        <w:rPr>
+          <w:rFonts w:ascii="Arial" w:hAnsi="Arial" w:cs="Arial"/>
+          <w:lang w:val="en-GB"/>
+        </w:rPr>
+        <w:t>)</w:t>
       </w:r>
     </w:p>
     <w:p>
@@ -21742,7 +21770,7 @@
         </w:rPr>
         <w:br/>
       </w:r>
-      <w:hyperlink r:id="rId25" w:history="1">
+      <w:hyperlink r:id="rId25" w:anchor="middleware" w:history="1">
         <w:r>
           <w:rPr>
             <w:rStyle w:val="Hipervnculo"/>
@@ -21758,7 +21786,7 @@
           <w:rFonts w:ascii="Arial" w:hAnsi="Arial" w:cs="Arial"/>
         </w:rPr>
       </w:pPr>
-      <w:hyperlink r:id="rId26" w:history="1">
+      <w:hyperlink r:id="rId26" w:anchor="login" w:history="1">
         <w:r>
           <w:rPr>
             <w:rStyle w:val="Hipervnculo"/>
@@ -21795,10 +21823,170 @@
       <w:pPr>
         <w:rPr>
           <w:rFonts w:ascii="Arial" w:hAnsi="Arial" w:cs="Arial"/>
-          <w:sz w:val="20"/>
-          <w:szCs w:val="20"/>
-        </w:rPr>
-      </w:pPr>
+          <w:color w:val="FF0000"/>
+          <w:sz w:val="48"/>
+          <w:szCs w:val="48"/>
+          <w:lang w:val="en-GB"/>
+        </w:rPr>
+      </w:pPr>
+      <w:r>
+        <w:rPr>
+          <w:rFonts w:ascii="Arial" w:hAnsi="Arial" w:cs="Arial"/>
+          <w:color w:val="FF0000"/>
+          <w:sz w:val="48"/>
+          <w:szCs w:val="48"/>
+          <w:lang w:val="en-GB"/>
+        </w:rPr>
+        <w:t>FLASK MAIL</w:t>
+      </w:r>
+    </w:p>
+    <w:p>
+      <w:pPr>
+        <w:rPr>
+          <w:rFonts w:ascii="Arial" w:hAnsi="Arial" w:cs="Arial"/>
+          <w:color w:val="FF0000"/>
+          <w:sz w:val="20"/>
+          <w:szCs w:val="20"/>
+          <w:lang w:val="en-GB"/>
+        </w:rPr>
+      </w:pPr>
+      <w:hyperlink r:id="rId28" w:history="1">
+        <w:r>
+          <w:rPr>
+            <w:rStyle w:val="Hipervnculo"/>
+            <w:rFonts w:ascii="Arial" w:hAnsi="Arial" w:cs="Arial"/>
+            <w:sz w:val="20"/>
+            <w:szCs w:val="20"/>
+            <w:lang w:val="en-GB"/>
+          </w:rPr>
+          <w:t>https://medium.com/@diego.coder/enviar-correos-con-flask-python-y-gmail-smtp-a99832cc6eae</w:t>
+        </w:r>
+      </w:hyperlink>
+    </w:p>
+    <w:p>
+      <w:pPr>
+        <w:rPr>
+          <w:rFonts w:ascii="Arial" w:hAnsi="Arial" w:cs="Arial"/>
+          <w:color w:val="FF0000"/>
+          <w:sz w:val="20"/>
+          <w:szCs w:val="20"/>
+          <w:lang w:val="en-GB"/>
+        </w:rPr>
+      </w:pPr>
+    </w:p>
+    <w:p>
+      <w:pPr>
+        <w:rPr>
+          <w:rFonts w:ascii="Arial" w:hAnsi="Arial" w:cs="Arial"/>
+          <w:color w:val="FF0000"/>
+          <w:sz w:val="48"/>
+          <w:szCs w:val="48"/>
+        </w:rPr>
+      </w:pPr>
+      <w:r>
+        <w:rPr>
+          <w:rFonts w:ascii="Arial" w:hAnsi="Arial" w:cs="Arial"/>
+          <w:color w:val="FF0000"/>
+          <w:sz w:val="48"/>
+          <w:szCs w:val="48"/>
+        </w:rPr>
+        <w:t>REFACTORING MASIVO</w:t>
+      </w:r>
+    </w:p>
+    <w:p>
+      <w:pPr>
+        <w:rPr>
+          <w:rFonts w:ascii="Arial" w:hAnsi="Arial" w:cs="Arial"/>
+          <w:sz w:val="20"/>
+          <w:szCs w:val="20"/>
+        </w:rPr>
+      </w:pPr>
+      <w:r>
+        <w:rPr>
+          <w:rFonts w:ascii="Arial" w:hAnsi="Arial" w:cs="Arial"/>
+          <w:sz w:val="20"/>
+          <w:szCs w:val="20"/>
+        </w:rPr>
+        <w:t>Se han</w:t>
+      </w:r>
+      <w:r>
+        <w:rPr>
+          <w:rFonts w:ascii="Arial" w:hAnsi="Arial" w:cs="Arial"/>
+          <w:sz w:val="20"/>
+          <w:szCs w:val="20"/>
+        </w:rPr>
+        <w:t xml:space="preserve"> creado las carpetas de los distintos microservicios y usado </w:t>
+      </w:r>
+      <w:proofErr w:type="spellStart"/>
+      <w:r>
+        <w:rPr>
+          <w:rFonts w:ascii="Arial" w:hAnsi="Arial" w:cs="Arial"/>
+          <w:sz w:val="20"/>
+          <w:szCs w:val="20"/>
+        </w:rPr>
+        <w:t>blueprints</w:t>
+      </w:r>
+      <w:proofErr w:type="spellEnd"/>
+      <w:r>
+        <w:rPr>
+          <w:rFonts w:ascii="Arial" w:hAnsi="Arial" w:cs="Arial"/>
+          <w:sz w:val="20"/>
+          <w:szCs w:val="20"/>
+        </w:rPr>
+        <w:t xml:space="preserve"> para manejarlo y dividirlo </w:t>
+      </w:r>
+      <w:r>
+        <w:rPr>
+          <w:rFonts w:ascii="Arial" w:hAnsi="Arial" w:cs="Arial"/>
+          <w:sz w:val="20"/>
+          <w:szCs w:val="20"/>
+        </w:rPr>
+        <w:t>de forma organizada</w:t>
+      </w:r>
+      <w:r>
+        <w:rPr>
+          <w:rFonts w:ascii="Arial" w:hAnsi="Arial" w:cs="Arial"/>
+          <w:sz w:val="20"/>
+          <w:szCs w:val="20"/>
+        </w:rPr>
+        <w:t xml:space="preserve">. Aún así queda un </w:t>
+      </w:r>
+      <w:proofErr w:type="spellStart"/>
+      <w:r>
+        <w:rPr>
+          <w:rFonts w:ascii="Arial" w:hAnsi="Arial" w:cs="Arial"/>
+          <w:sz w:val="20"/>
+          <w:szCs w:val="20"/>
+        </w:rPr>
+        <w:t>routes</w:t>
+      </w:r>
+      <w:proofErr w:type="spellEnd"/>
+      <w:r>
+        <w:rPr>
+          <w:rFonts w:ascii="Arial" w:hAnsi="Arial" w:cs="Arial"/>
+          <w:sz w:val="20"/>
+          <w:szCs w:val="20"/>
+        </w:rPr>
+        <w:t xml:space="preserve"> común para algunos </w:t>
+      </w:r>
+      <w:proofErr w:type="spellStart"/>
+      <w:r>
+        <w:rPr>
+          <w:rFonts w:ascii="Arial" w:hAnsi="Arial" w:cs="Arial"/>
+          <w:sz w:val="20"/>
+          <w:szCs w:val="20"/>
+        </w:rPr>
+        <w:t>endpoints</w:t>
+      </w:r>
+      <w:proofErr w:type="spellEnd"/>
+      <w:r>
+        <w:rPr>
+          <w:rFonts w:ascii="Arial" w:hAnsi="Arial" w:cs="Arial"/>
+          <w:sz w:val="20"/>
+          <w:szCs w:val="20"/>
+        </w:rPr>
+        <w:t xml:space="preserve"> específicos o auxiliares para la aplicación.</w:t>
+      </w:r>
     </w:p>
     <w:sectPr>
       <w:pgSz w:w="11906" w:h="16838"/>

</xml_diff>